<commit_message>
sesuaikan path dan ganti istilah Inggris ke bahasa Indonesia
- perbarui semua path di SQL, notebook, Excel, laporan ke struktur baru
- kode pertanyaan Q1-Q5 menjadi P1-P5 di seluruh dokumen
- terjemahkan istilah Inggris di laporan (md/docx/pdf), presentasi, komentar SQL
- Excel: arahkan Power Query ke CSV baru, hapus kueri lama yang tidak terpakai,
  refresh ulang (7/7 metrik cocok)
- tambah 01_data_dan_pertanyaan/pertanyaan_bisnis.md dan 02_proses/README.md
- README utama ditulis ulang untuk pembaca klien
</commit_message>
<xml_diff>
--- a/03_hasil/laporan_diagnosis_keterlambatan.docx
+++ b/03_hasil/laporan_diagnosis_keterlambatan.docx
@@ -124,28 +124,25 @@
         <w:rPr>
           <w:lang w:val="en-ID"/>
         </w:rPr>
-        <w:t xml:space="preserve"> oleh Arif Herfian Zaen Chartiko (Operations Analyst) </w:t>
-      </w:r>
-      <w:proofErr w:type="spellStart"/>
-      <w:r>
-        <w:rPr>
-          <w:lang w:val="en-ID"/>
-        </w:rPr>
-        <w:t>untuk</w:t>
-      </w:r>
-      <w:proofErr w:type="spellEnd"/>
-      <w:r>
-        <w:rPr>
-          <w:lang w:val="en-ID"/>
-        </w:rPr>
-        <w:t xml:space="preserve"> Head of Logistics &amp; </w:t>
-      </w:r>
-      <w:proofErr w:type="spellStart"/>
-      <w:r>
-        <w:rPr>
-          <w:lang w:val="en-ID"/>
-        </w:rPr>
-        <w:t>Fulfillment</w:t>
+        <w:t xml:space="preserve"> oleh Arif Herfian Zaen Chartiko (Analis Operasional) untuk Kepala Divisi Logistik &amp; Pemenuhan Pesanan</w:t>
+      </w:r>
+      <w:proofErr w:type="spellStart"/>
+      <w:r>
+        <w:rPr>
+          <w:lang w:val="en-ID"/>
+        </w:rPr>
+      </w:r>
+      <w:proofErr w:type="spellEnd"/>
+      <w:r>
+        <w:rPr>
+          <w:lang w:val="en-ID"/>
+        </w:rPr>
+      </w:r>
+      <w:proofErr w:type="spellStart"/>
+      <w:r>
+        <w:rPr>
+          <w:lang w:val="en-ID"/>
+        </w:rPr>
       </w:r>
       <w:proofErr w:type="spellEnd"/>
     </w:p>
@@ -345,14 +342,13 @@
         <w:rPr>
           <w:lang w:val="en-ID"/>
         </w:rPr>
-        <w:t xml:space="preserve">. On-Time Delivery Rate </w:t>
-      </w:r>
-      <w:proofErr w:type="spellStart"/>
-      <w:r>
-        <w:rPr>
-          <w:lang w:val="en-ID"/>
-        </w:rPr>
-        <w:t>berada</w:t>
+        <w:t>. Tingkat ketepatan waktu pengiriman (OTD) berada</w:t>
+      </w:r>
+      <w:proofErr w:type="spellStart"/>
+      <w:r>
+        <w:rPr>
+          <w:lang w:val="en-ID"/>
+        </w:rPr>
       </w:r>
       <w:proofErr w:type="spellEnd"/>
       <w:r>
@@ -3167,14 +3163,14 @@
         <w:rPr>
           <w:lang w:val="en-ID"/>
         </w:rPr>
-        <w:t>saat</w:t>
-      </w:r>
-      <w:proofErr w:type="spellEnd"/>
-      <w:r>
-        <w:rPr>
-          <w:lang w:val="en-ID"/>
-        </w:rPr>
-        <w:t xml:space="preserve"> checkout. </w:t>
+        <w:t>saat transaksi</w:t>
+      </w:r>
+      <w:proofErr w:type="spellEnd"/>
+      <w:r>
+        <w:rPr>
+          <w:lang w:val="en-ID"/>
+        </w:rPr>
+        <w:t xml:space="preserve">. </w:t>
       </w:r>
       <w:proofErr w:type="spellStart"/>
       <w:r>
@@ -3527,7 +3523,7 @@
               <w:rPr>
                 <w:lang w:val="en-ID"/>
               </w:rPr>
-              <w:t>Q1</w:t>
+              <w:t>P1</w:t>
             </w:r>
           </w:p>
         </w:tc>
@@ -3717,7 +3713,7 @@
               <w:rPr>
                 <w:lang w:val="en-ID"/>
               </w:rPr>
-              <w:t>Q2</w:t>
+              <w:t>P2</w:t>
             </w:r>
           </w:p>
         </w:tc>
@@ -3871,7 +3867,7 @@
               <w:rPr>
                 <w:lang w:val="en-ID"/>
               </w:rPr>
-              <w:t>Q3</w:t>
+              <w:t>P3</w:t>
             </w:r>
           </w:p>
         </w:tc>
@@ -4061,7 +4057,7 @@
               <w:rPr>
                 <w:lang w:val="en-ID"/>
               </w:rPr>
-              <w:t>Q4</w:t>
+              <w:t>P4</w:t>
             </w:r>
           </w:p>
         </w:tc>
@@ -4187,7 +4183,7 @@
               <w:rPr>
                 <w:lang w:val="en-ID"/>
               </w:rPr>
-              <w:t>Q5</w:t>
+              <w:t>P5</w:t>
             </w:r>
           </w:p>
         </w:tc>
@@ -4720,7 +4716,7 @@
               <w:rPr>
                 <w:lang w:val="en-ID"/>
               </w:rPr>
-              <w:t>PostgreSQL, view </w:t>
+              <w:t xml:space="preserve">Basis data PostgreSQL, tabel analisis analytics.fact_order_delivery</w:t>
             </w:r>
             <w:proofErr w:type="spellStart"/>
             <w:proofErr w:type="gramStart"/>
@@ -4728,14 +4724,14 @@
               <w:rPr>
                 <w:lang w:val="en-ID"/>
               </w:rPr>
-              <w:t>analytics.fact</w:t>
+              <w:t xml:space="preserve"/>
             </w:r>
             <w:proofErr w:type="gramEnd"/>
             <w:r>
               <w:rPr>
                 <w:lang w:val="en-ID"/>
               </w:rPr>
-              <w:t>_order_delivery</w:t>
+              <w:t xml:space="preserve"/>
             </w:r>
             <w:proofErr w:type="spellEnd"/>
           </w:p>
@@ -4959,14 +4955,14 @@
               <w:rPr>
                 <w:lang w:val="en-ID"/>
               </w:rPr>
-              <w:t>berstatus</w:t>
+              <w:t xml:space="preserve">berstatus terkirim (delivered)</w:t>
             </w:r>
             <w:proofErr w:type="spellEnd"/>
             <w:r>
               <w:rPr>
                 <w:lang w:val="en-ID"/>
               </w:rPr>
-              <w:t> delivered </w:t>
+              <w:t xml:space="preserve"> </w:t>
             </w:r>
             <w:proofErr w:type="spellStart"/>
             <w:r>
@@ -5980,7 +5976,7 @@
         <w:rPr>
           <w:lang w:val="en-ID"/>
         </w:rPr>
-        <w:t xml:space="preserve"> Q2 </w:t>
+        <w:t xml:space="preserve"> P2 </w:t>
       </w:r>
       <w:proofErr w:type="spellStart"/>
       <w:r>
@@ -6381,28 +6377,28 @@
         <w:rPr>
           <w:lang w:val="en-ID"/>
         </w:rPr>
-        <w:t>ditandai</w:t>
-      </w:r>
-      <w:proofErr w:type="spellEnd"/>
-      <w:r>
-        <w:rPr>
-          <w:lang w:val="en-ID"/>
-        </w:rPr>
-        <w:t> </w:t>
-      </w:r>
-      <w:proofErr w:type="spellStart"/>
-      <w:r>
-        <w:rPr>
-          <w:lang w:val="en-ID"/>
-        </w:rPr>
-        <w:t>has_sequence_anomaly</w:t>
-      </w:r>
-      <w:proofErr w:type="spellEnd"/>
-      <w:r>
-        <w:rPr>
-          <w:lang w:val="en-ID"/>
-        </w:rPr>
-        <w:t xml:space="preserve"> dan </w:t>
+        <w:t xml:space="preserve">ditandai sebagai anomali dan</w:t>
+      </w:r>
+      <w:proofErr w:type="spellEnd"/>
+      <w:r>
+        <w:rPr>
+          <w:lang w:val="en-ID"/>
+        </w:rPr>
+        <w:t xml:space="preserve"/>
+      </w:r>
+      <w:proofErr w:type="spellStart"/>
+      <w:r>
+        <w:rPr>
+          <w:lang w:val="en-ID"/>
+        </w:rPr>
+        <w:t xml:space="preserve"/>
+      </w:r>
+      <w:proofErr w:type="spellEnd"/>
+      <w:r>
+        <w:rPr>
+          <w:lang w:val="en-ID"/>
+        </w:rPr>
+        <w:t xml:space="preserve"> </w:t>
       </w:r>
       <w:proofErr w:type="spellStart"/>
       <w:r>
@@ -7201,21 +7197,19 @@
         <w:rPr>
           <w:lang w:val="en-ID"/>
         </w:rPr>
-        <w:t>kinerja</w:t>
-      </w:r>
-      <w:proofErr w:type="spellEnd"/>
-      <w:r>
-        <w:rPr>
-          <w:lang w:val="en-ID"/>
-        </w:rPr>
-        <w:t xml:space="preserve">, On-Time Delivery Rate </w:t>
-      </w:r>
-      <w:proofErr w:type="spellStart"/>
-      <w:r>
-        <w:rPr>
-          <w:lang w:val="en-ID"/>
-        </w:rPr>
-        <w:t>berada</w:t>
+        <w:t>kinerja, tingkat ketepatan waktu pengiriman (OTD) berada</w:t>
+      </w:r>
+      <w:proofErr w:type="spellEnd"/>
+      <w:r>
+        <w:rPr>
+          <w:lang w:val="en-ID"/>
+        </w:rPr>
+      </w:r>
+      <w:proofErr w:type="spellStart"/>
+      <w:r>
+        <w:rPr>
+          <w:lang w:val="en-ID"/>
+        </w:rPr>
       </w:r>
       <w:proofErr w:type="spellEnd"/>
       <w:r>
@@ -15818,7 +15812,7 @@
                 <w:bCs/>
                 <w:lang w:val="en-ID"/>
               </w:rPr>
-              <w:t>Transit p90</w:t>
+              <w:t>Transit persentil-90</w:t>
             </w:r>
           </w:p>
         </w:tc>
@@ -16193,7 +16187,7 @@
         <w:rPr>
           <w:lang w:val="en-ID"/>
         </w:rPr>
-        <w:t>Dari 21 kategori dengan minimal 1.000 item, tingkat keterlambatan berada di rentang 5,39% sampai 9,75%, jauh lebih sempit dari rentang antarprovinsi 5,02% sampai 19,64%. Berat produk juga tidak menunjukkan pola: electronics yang ringan (median 200 g) justru tertinggi, sementara office_furniture yang berat (median 10.975 g) berada di 8,91%.</w:t>
+        <w:t>Dari 21 kategori dengan minimal 1.000 item, tingkat keterlambatan berada di rentang 5,39% sampai 9,75%, jauh lebih sempit dari rentang antarprovinsi 5,02% sampai 19,64%. Berat produk juga tidak menunjukkan pola: kategori elektronik yang ringan (median 200 g) justru tertinggi, sementara furnitur kantor yang berat (median 10.975 g) berada di 8,91%.</w:t>
       </w:r>
       <w:proofErr w:type="spellEnd"/>
       <w:proofErr w:type="spellStart"/>
@@ -26690,14 +26684,14 @@
         <w:rPr>
           <w:lang w:val="en-ID"/>
         </w:rPr>
-        <w:t>berstatus</w:t>
-      </w:r>
-      <w:proofErr w:type="spellEnd"/>
-      <w:r>
-        <w:rPr>
-          <w:lang w:val="en-ID"/>
-        </w:rPr>
-        <w:t xml:space="preserve"> delivered yang </w:t>
+        <w:t xml:space="preserve">berstatus terkirim (delivered)</w:t>
+      </w:r>
+      <w:proofErr w:type="spellEnd"/>
+      <w:r>
+        <w:rPr>
+          <w:lang w:val="en-ID"/>
+        </w:rPr>
+        <w:t xml:space="preserve"> yang </w:t>
       </w:r>
       <w:proofErr w:type="spellStart"/>
       <w:r>
@@ -28047,7 +28041,7 @@
         <w:rPr>
           <w:lang w:val="en-ID"/>
         </w:rPr>
-        <w:t xml:space="preserve"> Q5. </w:t>
+        <w:t xml:space="preserve"> P5. </w:t>
       </w:r>
       <w:proofErr w:type="spellStart"/>
       <w:r>
@@ -29205,7 +29199,7 @@
               <w:rPr>
                 <w:lang w:val="en-ID"/>
               </w:rPr>
-              <w:t>02_sql/01_create_schema.sql – 03_add_constraints.sql</w:t>
+              <w:t xml:space="preserve">02_proses/sql/01_buat_skema.sql – 03_pasang_kunci_relasi.sql</w:t>
             </w:r>
           </w:p>
         </w:tc>
@@ -29305,7 +29299,7 @@
               <w:rPr>
                 <w:lang w:val="en-ID"/>
               </w:rPr>
-              <w:t>02_sql/04_data_quality_audit.sql</w:t>
+              <w:t>02_proses/sql/04_audit_kualitas_data.sql</w:t>
             </w:r>
           </w:p>
         </w:tc>
@@ -29375,7 +29369,7 @@
               <w:rPr>
                 <w:lang w:val="en-ID"/>
               </w:rPr>
-              <w:t>02_sql/05_build_fact_table.sql</w:t>
+              <w:t>02_proses/sql/05_bangun_tabel_fakta.sql</w:t>
             </w:r>
           </w:p>
         </w:tc>
@@ -29489,7 +29483,7 @@
               <w:rPr>
                 <w:lang w:val="en-ID"/>
               </w:rPr>
-              <w:t>02_sql/06_analysis_q1_q5.sql</w:t>
+              <w:t>02_proses/sql/06_analisis_p1_p5.sql</w:t>
             </w:r>
           </w:p>
         </w:tc>
@@ -29517,28 +29511,26 @@
               <w:rPr>
                 <w:lang w:val="en-ID"/>
               </w:rPr>
-              <w:t>Seluruh</w:t>
+              <w:t>Seluruh kueri dan kesimpulan</w:t>
             </w:r>
             <w:proofErr w:type="spellEnd"/>
             <w:r>
               <w:rPr>
                 <w:lang w:val="en-ID"/>
               </w:rPr>
-              <w:t xml:space="preserve"> query dan </w:t>
             </w:r>
             <w:proofErr w:type="spellStart"/>
             <w:r>
               <w:rPr>
                 <w:lang w:val="en-ID"/>
               </w:rPr>
-              <w:t>kesimpulan</w:t>
             </w:r>
             <w:proofErr w:type="spellEnd"/>
             <w:r>
               <w:rPr>
                 <w:lang w:val="en-ID"/>
               </w:rPr>
-              <w:t xml:space="preserve"> Q1–Q5</w:t>
+              <w:t xml:space="preserve"> P1–P5</w:t>
             </w:r>
           </w:p>
         </w:tc>
@@ -29567,7 +29559,7 @@
               <w:rPr>
                 <w:lang w:val="en-ID"/>
               </w:rPr>
-              <w:t>02_sql/07_build_seller_view.sql</w:t>
+              <w:t>02_proses/sql/07_bangun_ringkasan_penjual.sql</w:t>
             </w:r>
           </w:p>
         </w:tc>
@@ -29594,28 +29586,25 @@
               <w:rPr>
                 <w:lang w:val="en-ID"/>
               </w:rPr>
-              <w:t xml:space="preserve">View </w:t>
+              <w:t>Ringkasan kinerja penjual</w:t>
             </w:r>
             <w:proofErr w:type="spellStart"/>
             <w:r>
               <w:rPr>
                 <w:lang w:val="en-ID"/>
               </w:rPr>
-              <w:t>kinerja</w:t>
             </w:r>
             <w:proofErr w:type="spellEnd"/>
             <w:r>
               <w:rPr>
                 <w:lang w:val="en-ID"/>
               </w:rPr>
-              <w:t xml:space="preserve"> </w:t>
             </w:r>
             <w:proofErr w:type="spellStart"/>
             <w:r>
               <w:rPr>
                 <w:lang w:val="en-ID"/>
               </w:rPr>
-              <w:t>penjual</w:t>
             </w:r>
             <w:proofErr w:type="spellEnd"/>
           </w:p>
@@ -29645,7 +29634,7 @@
               <w:rPr>
                 <w:lang w:val="en-ID"/>
               </w:rPr>
-              <w:t>02_sql/08_build_state_ref.sql</w:t>
+              <w:t>02_proses/sql/08_bangun_rujukan_provinsi.sql</w:t>
             </w:r>
           </w:p>
         </w:tc>
@@ -29717,7 +29706,7 @@
               <w:rPr>
                 <w:lang w:val="en-ID"/>
               </w:rPr>
-              <w:t>03_python/01_validation.ipynb</w:t>
+              <w:t>02_proses/python/validasi_silang.ipynb</w:t>
             </w:r>
           </w:p>
         </w:tc>
@@ -29803,14 +29792,13 @@
               <w:rPr>
                 <w:lang w:val="en-ID"/>
               </w:rPr>
-              <w:t>05_dashboard/</w:t>
+              <w:t>03_hasil/dasbor/dasbor_keterlambatan_pengiriman.pbix</w:t>
             </w:r>
             <w:proofErr w:type="spellStart"/>
             <w:r>
               <w:rPr>
                 <w:lang w:val="en-ID"/>
               </w:rPr>
-              <w:t>olist_ops_dashboard.pbix</w:t>
             </w:r>
             <w:proofErr w:type="spellEnd"/>
           </w:p>
@@ -29875,7 +29863,7 @@
               <w:rPr>
                 <w:lang w:val="en-ID"/>
               </w:rPr>
-              <w:t>05_dashboard/olist_ops_dashboard.pdf</w:t>
+              <w:t>03_hasil/dasbor/dasbor_keterlambatan_pengiriman.pdf</w:t>
             </w:r>
           </w:p>
         </w:tc>
@@ -30177,7 +30165,7 @@
               <w:rPr>
                 <w:lang w:val="en-ID"/>
               </w:rPr>
-              <w:t>OTD Rate</w:t>
+              <w:t>Tingkat OTD</w:t>
             </w:r>
           </w:p>
         </w:tc>
@@ -30204,14 +30192,13 @@
               <w:rPr>
                 <w:lang w:val="en-ID"/>
               </w:rPr>
-              <w:t xml:space="preserve">On-Time Delivery Rate, </w:t>
+              <w:t>Tingkat ketepatan waktu pengiriman (on-time delivery), persentase</w:t>
             </w:r>
             <w:proofErr w:type="spellStart"/>
             <w:r>
               <w:rPr>
                 <w:lang w:val="en-ID"/>
               </w:rPr>
-              <w:t>persentase</w:t>
             </w:r>
             <w:proofErr w:type="spellEnd"/>
             <w:r>

</xml_diff>